<commit_message>
Added an explanatory note
</commit_message>
<xml_diff>
--- a/Пояснительная записка.docx
+++ b/Пояснительная записка.docx
@@ -42,7 +42,6 @@
         </w:rPr>
         <w:br/>
       </w:r>
-      <w:proofErr w:type="spellStart"/>
       <w:r>
         <w:rPr>
           <w:rFonts w:ascii="Segoe UI" w:eastAsia="Times New Roman" w:hAnsi="Segoe UI" w:cs="Segoe UI"/>
@@ -55,9 +54,23 @@
           <w:lang w:eastAsia="ru-RU"/>
           <w14:ligatures w14:val="none"/>
         </w:rPr>
-        <w:t>Fate</w:t>
-      </w:r>
-      <w:proofErr w:type="spellEnd"/>
+        <w:t>Fate Deck</w:t>
+      </w:r>
+    </w:p>
+    <w:p>
+      <w:pPr>
+        <w:shd w:val="clear" w:color="auto" w:fill="FFFFFF"/>
+        <w:spacing w:before="240" w:after="240" w:line="240" w:lineRule="auto"/>
+        <w:rPr>
+          <w:rFonts w:ascii="Segoe UI" w:eastAsia="Times New Roman" w:hAnsi="Segoe UI" w:cs="Segoe UI"/>
+          <w:color w:val="0F1115"/>
+          <w:kern w:val="0"/>
+          <w:sz w:val="24"/>
+          <w:szCs w:val="24"/>
+          <w:lang w:eastAsia="ru-RU"/>
+          <w14:ligatures w14:val="none"/>
+        </w:rPr>
+      </w:pPr>
       <w:r>
         <w:rPr>
           <w:rFonts w:ascii="Segoe UI" w:eastAsia="Times New Roman" w:hAnsi="Segoe UI" w:cs="Segoe UI"/>
@@ -70,9 +83,36 @@
           <w:lang w:eastAsia="ru-RU"/>
           <w14:ligatures w14:val="none"/>
         </w:rPr>
-        <w:t xml:space="preserve"> </w:t>
-      </w:r>
-      <w:proofErr w:type="spellStart"/>
+        <w:t>2. Автор проекта</w:t>
+      </w:r>
+      <w:r>
+        <w:rPr>
+          <w:rFonts w:ascii="Segoe UI" w:eastAsia="Times New Roman" w:hAnsi="Segoe UI" w:cs="Segoe UI"/>
+          <w:color w:val="0F1115"/>
+          <w:kern w:val="0"/>
+          <w:sz w:val="24"/>
+          <w:szCs w:val="24"/>
+          <w:lang w:eastAsia="ru-RU"/>
+          <w14:ligatures w14:val="none"/>
+        </w:rPr>
+        <w:br/>
+        <w:t>Никифоров Матвей</w:t>
+      </w:r>
+    </w:p>
+    <w:p>
+      <w:pPr>
+        <w:shd w:val="clear" w:color="auto" w:fill="FFFFFF"/>
+        <w:spacing w:before="240" w:after="240" w:line="240" w:lineRule="auto"/>
+        <w:rPr>
+          <w:rFonts w:ascii="Segoe UI" w:eastAsia="Times New Roman" w:hAnsi="Segoe UI" w:cs="Segoe UI"/>
+          <w:color w:val="0F1115"/>
+          <w:kern w:val="0"/>
+          <w:sz w:val="24"/>
+          <w:szCs w:val="24"/>
+          <w:lang w:eastAsia="ru-RU"/>
+          <w14:ligatures w14:val="none"/>
+        </w:rPr>
+      </w:pPr>
       <w:r>
         <w:rPr>
           <w:rFonts w:ascii="Segoe UI" w:eastAsia="Times New Roman" w:hAnsi="Segoe UI" w:cs="Segoe UI"/>
@@ -85,37 +125,7 @@
           <w:lang w:eastAsia="ru-RU"/>
           <w14:ligatures w14:val="none"/>
         </w:rPr>
-        <w:t>Deck</w:t>
-      </w:r>
-      <w:proofErr w:type="spellEnd"/>
-    </w:p>
-    <w:p>
-      <w:pPr>
-        <w:shd w:val="clear" w:color="auto" w:fill="FFFFFF"/>
-        <w:spacing w:before="240" w:after="240" w:line="240" w:lineRule="auto"/>
-        <w:rPr>
-          <w:rFonts w:ascii="Segoe UI" w:eastAsia="Times New Roman" w:hAnsi="Segoe UI" w:cs="Segoe UI"/>
-          <w:color w:val="0F1115"/>
-          <w:kern w:val="0"/>
-          <w:sz w:val="24"/>
-          <w:szCs w:val="24"/>
-          <w:lang w:eastAsia="ru-RU"/>
-          <w14:ligatures w14:val="none"/>
-        </w:rPr>
-      </w:pPr>
-      <w:r>
-        <w:rPr>
-          <w:rFonts w:ascii="Segoe UI" w:eastAsia="Times New Roman" w:hAnsi="Segoe UI" w:cs="Segoe UI"/>
-          <w:b/>
-          <w:bCs/>
-          <w:color w:val="0F1115"/>
-          <w:kern w:val="0"/>
-          <w:sz w:val="24"/>
-          <w:szCs w:val="24"/>
-          <w:lang w:eastAsia="ru-RU"/>
-          <w14:ligatures w14:val="none"/>
-        </w:rPr>
-        <w:t>2. Автор проекта</w:t>
+        <w:t>3. Описание идеи</w:t>
       </w:r>
       <w:r>
         <w:rPr>
@@ -128,152 +138,7 @@
           <w14:ligatures w14:val="none"/>
         </w:rPr>
         <w:br/>
-        <w:t>Никифоров Матвей</w:t>
-      </w:r>
-    </w:p>
-    <w:p>
-      <w:pPr>
-        <w:shd w:val="clear" w:color="auto" w:fill="FFFFFF"/>
-        <w:spacing w:before="240" w:after="240" w:line="240" w:lineRule="auto"/>
-        <w:rPr>
-          <w:rFonts w:ascii="Segoe UI" w:eastAsia="Times New Roman" w:hAnsi="Segoe UI" w:cs="Segoe UI"/>
-          <w:color w:val="0F1115"/>
-          <w:kern w:val="0"/>
-          <w:sz w:val="24"/>
-          <w:szCs w:val="24"/>
-          <w:lang w:eastAsia="ru-RU"/>
-          <w14:ligatures w14:val="none"/>
-        </w:rPr>
-      </w:pPr>
-      <w:r>
-        <w:rPr>
-          <w:rFonts w:ascii="Segoe UI" w:eastAsia="Times New Roman" w:hAnsi="Segoe UI" w:cs="Segoe UI"/>
-          <w:b/>
-          <w:bCs/>
-          <w:color w:val="0F1115"/>
-          <w:kern w:val="0"/>
-          <w:sz w:val="24"/>
-          <w:szCs w:val="24"/>
-          <w:lang w:eastAsia="ru-RU"/>
-          <w14:ligatures w14:val="none"/>
-        </w:rPr>
-        <w:t>3. Описание идеи</w:t>
-      </w:r>
-      <w:r>
-        <w:rPr>
-          <w:rFonts w:ascii="Segoe UI" w:eastAsia="Times New Roman" w:hAnsi="Segoe UI" w:cs="Segoe UI"/>
-          <w:color w:val="0F1115"/>
-          <w:kern w:val="0"/>
-          <w:sz w:val="24"/>
-          <w:szCs w:val="24"/>
-          <w:lang w:eastAsia="ru-RU"/>
-          <w14:ligatures w14:val="none"/>
-        </w:rPr>
-        <w:br/>
-      </w:r>
-      <w:proofErr w:type="spellStart"/>
-      <w:r>
-        <w:rPr>
-          <w:rFonts w:ascii="Segoe UI" w:eastAsia="Times New Roman" w:hAnsi="Segoe UI" w:cs="Segoe UI"/>
-          <w:color w:val="0F1115"/>
-          <w:kern w:val="0"/>
-          <w:sz w:val="24"/>
-          <w:szCs w:val="24"/>
-          <w:lang w:eastAsia="ru-RU"/>
-          <w14:ligatures w14:val="none"/>
-        </w:rPr>
-        <w:t>Fate</w:t>
-      </w:r>
-      <w:proofErr w:type="spellEnd"/>
-      <w:r>
-        <w:rPr>
-          <w:rFonts w:ascii="Segoe UI" w:eastAsia="Times New Roman" w:hAnsi="Segoe UI" w:cs="Segoe UI"/>
-          <w:color w:val="0F1115"/>
-          <w:kern w:val="0"/>
-          <w:sz w:val="24"/>
-          <w:szCs w:val="24"/>
-          <w:lang w:eastAsia="ru-RU"/>
-          <w14:ligatures w14:val="none"/>
-        </w:rPr>
-        <w:t xml:space="preserve"> </w:t>
-      </w:r>
-      <w:proofErr w:type="spellStart"/>
-      <w:r>
-        <w:rPr>
-          <w:rFonts w:ascii="Segoe UI" w:eastAsia="Times New Roman" w:hAnsi="Segoe UI" w:cs="Segoe UI"/>
-          <w:color w:val="0F1115"/>
-          <w:kern w:val="0"/>
-          <w:sz w:val="24"/>
-          <w:szCs w:val="24"/>
-          <w:lang w:eastAsia="ru-RU"/>
-          <w14:ligatures w14:val="none"/>
-        </w:rPr>
-        <w:t>Deck</w:t>
-      </w:r>
-      <w:proofErr w:type="spellEnd"/>
-      <w:r>
-        <w:rPr>
-          <w:rFonts w:ascii="Segoe UI" w:eastAsia="Times New Roman" w:hAnsi="Segoe UI" w:cs="Segoe UI"/>
-          <w:color w:val="0F1115"/>
-          <w:kern w:val="0"/>
-          <w:sz w:val="24"/>
-          <w:szCs w:val="24"/>
-          <w:lang w:eastAsia="ru-RU"/>
-          <w14:ligatures w14:val="none"/>
-        </w:rPr>
-        <w:t xml:space="preserve"> - карточная RPG игра, в которой игрок исследует подземелье, сражается с врагами в тактических пошаговых битвах с использованием системы карт. Основная особенность - уникальная боевая система с четырьмя типами карт и визуальные эффекты для врагов. Подземелье фиксированное, созданное в редакторе </w:t>
-      </w:r>
-      <w:proofErr w:type="spellStart"/>
-      <w:r>
-        <w:rPr>
-          <w:rFonts w:ascii="Segoe UI" w:eastAsia="Times New Roman" w:hAnsi="Segoe UI" w:cs="Segoe UI"/>
-          <w:color w:val="0F1115"/>
-          <w:kern w:val="0"/>
-          <w:sz w:val="24"/>
-          <w:szCs w:val="24"/>
-          <w:lang w:eastAsia="ru-RU"/>
-          <w14:ligatures w14:val="none"/>
-        </w:rPr>
-        <w:t>Tiled</w:t>
-      </w:r>
-      <w:proofErr w:type="spellEnd"/>
-      <w:r>
-        <w:rPr>
-          <w:rFonts w:ascii="Segoe UI" w:eastAsia="Times New Roman" w:hAnsi="Segoe UI" w:cs="Segoe UI"/>
-          <w:color w:val="0F1115"/>
-          <w:kern w:val="0"/>
-          <w:sz w:val="24"/>
-          <w:szCs w:val="24"/>
-          <w:lang w:eastAsia="ru-RU"/>
-          <w14:ligatures w14:val="none"/>
-        </w:rPr>
-        <w:t xml:space="preserve">, с различными зонами </w:t>
-      </w:r>
-      <w:proofErr w:type="spellStart"/>
-      <w:r>
-        <w:rPr>
-          <w:rFonts w:ascii="Segoe UI" w:eastAsia="Times New Roman" w:hAnsi="Segoe UI" w:cs="Segoe UI"/>
-          <w:color w:val="0F1115"/>
-          <w:kern w:val="0"/>
-          <w:sz w:val="24"/>
-          <w:szCs w:val="24"/>
-          <w:lang w:eastAsia="ru-RU"/>
-          <w14:ligatures w14:val="none"/>
-        </w:rPr>
-        <w:t>спавна</w:t>
-      </w:r>
-      <w:proofErr w:type="spellEnd"/>
-      <w:r>
-        <w:rPr>
-          <w:rFonts w:ascii="Segoe UI" w:eastAsia="Times New Roman" w:hAnsi="Segoe UI" w:cs="Segoe UI"/>
-          <w:color w:val="0F1115"/>
-          <w:kern w:val="0"/>
-          <w:sz w:val="24"/>
-          <w:szCs w:val="24"/>
-          <w:lang w:eastAsia="ru-RU"/>
-          <w14:ligatures w14:val="none"/>
-        </w:rPr>
-        <w:t xml:space="preserve"> врагов и взаимодействиями.</w:t>
+        <w:t>Fate Deck - карточная RPG игра, в которой игрок исследует подземелье, сражается с врагами в тактических пошаговых битвах с использованием системы карт. Основная особенность - уникальная боевая система с четырьмя типами карт и визуальные эффекты для врагов. Подземелье фиксированное, созданное в редакторе Tiled, с различными зонами спавна врагов и взаимодействиями.</w:t>
       </w:r>
     </w:p>
     <w:p>
@@ -352,7 +217,6 @@
           <w14:ligatures w14:val="none"/>
         </w:rPr>
       </w:pPr>
-      <w:proofErr w:type="spellStart"/>
       <w:r>
         <w:rPr>
           <w:rFonts w:ascii="Segoe UI" w:eastAsia="Times New Roman" w:hAnsi="Segoe UI" w:cs="Segoe UI"/>
@@ -367,7 +231,6 @@
         </w:rPr>
         <w:t>DungeonWindow</w:t>
       </w:r>
-      <w:proofErr w:type="spellEnd"/>
       <w:r>
         <w:rPr>
           <w:rFonts w:ascii="Segoe UI" w:eastAsia="Times New Roman" w:hAnsi="Segoe UI" w:cs="Segoe UI"/>
@@ -399,7 +262,6 @@
           <w14:ligatures w14:val="none"/>
         </w:rPr>
       </w:pPr>
-      <w:proofErr w:type="spellStart"/>
       <w:r>
         <w:rPr>
           <w:rFonts w:ascii="Segoe UI" w:eastAsia="Times New Roman" w:hAnsi="Segoe UI" w:cs="Segoe UI"/>
@@ -414,7 +276,6 @@
         </w:rPr>
         <w:t>BattleWindow</w:t>
       </w:r>
-      <w:proofErr w:type="spellEnd"/>
       <w:r>
         <w:rPr>
           <w:rFonts w:ascii="Segoe UI" w:eastAsia="Times New Roman" w:hAnsi="Segoe UI" w:cs="Segoe UI"/>
@@ -491,7 +352,6 @@
           <w14:ligatures w14:val="none"/>
         </w:rPr>
       </w:pPr>
-      <w:proofErr w:type="spellStart"/>
       <w:r>
         <w:rPr>
           <w:rFonts w:ascii="Segoe UI" w:eastAsia="Times New Roman" w:hAnsi="Segoe UI" w:cs="Segoe UI"/>
@@ -506,7 +366,6 @@
         </w:rPr>
         <w:t>WorldPlayer</w:t>
       </w:r>
-      <w:proofErr w:type="spellEnd"/>
       <w:r>
         <w:rPr>
           <w:rFonts w:ascii="Segoe UI" w:eastAsia="Times New Roman" w:hAnsi="Segoe UI" w:cs="Segoe UI"/>
@@ -538,7 +397,6 @@
           <w14:ligatures w14:val="none"/>
         </w:rPr>
       </w:pPr>
-      <w:proofErr w:type="spellStart"/>
       <w:r>
         <w:rPr>
           <w:rFonts w:ascii="Segoe UI" w:eastAsia="Times New Roman" w:hAnsi="Segoe UI" w:cs="Segoe UI"/>
@@ -553,7 +411,6 @@
         </w:rPr>
         <w:t>WorldEnemy</w:t>
       </w:r>
-      <w:proofErr w:type="spellEnd"/>
       <w:r>
         <w:rPr>
           <w:rFonts w:ascii="Segoe UI" w:eastAsia="Times New Roman" w:hAnsi="Segoe UI" w:cs="Segoe UI"/>
@@ -585,7 +442,6 @@
           <w14:ligatures w14:val="none"/>
         </w:rPr>
       </w:pPr>
-      <w:proofErr w:type="spellStart"/>
       <w:r>
         <w:rPr>
           <w:rFonts w:ascii="Segoe UI" w:eastAsia="Times New Roman" w:hAnsi="Segoe UI" w:cs="Segoe UI"/>
@@ -600,7 +456,6 @@
         </w:rPr>
         <w:t>GameDatabase</w:t>
       </w:r>
-      <w:proofErr w:type="spellEnd"/>
       <w:r>
         <w:rPr>
           <w:rFonts w:ascii="Segoe UI" w:eastAsia="Times New Roman" w:hAnsi="Segoe UI" w:cs="Segoe UI"/>
@@ -714,33 +569,7 @@
           <w:lang w:eastAsia="ru-RU"/>
           <w14:ligatures w14:val="none"/>
         </w:rPr>
-        <w:t xml:space="preserve"> level2.tmx (создан в редакторе </w:t>
-      </w:r>
-      <w:proofErr w:type="spellStart"/>
-      <w:r>
-        <w:rPr>
-          <w:rFonts w:ascii="Segoe UI" w:eastAsia="Times New Roman" w:hAnsi="Segoe UI" w:cs="Segoe UI"/>
-          <w:color w:val="0F1115"/>
-          <w:kern w:val="0"/>
-          <w:sz w:val="24"/>
-          <w:szCs w:val="24"/>
-          <w:lang w:eastAsia="ru-RU"/>
-          <w14:ligatures w14:val="none"/>
-        </w:rPr>
-        <w:t>Tiled</w:t>
-      </w:r>
-      <w:proofErr w:type="spellEnd"/>
-      <w:r>
-        <w:rPr>
-          <w:rFonts w:ascii="Segoe UI" w:eastAsia="Times New Roman" w:hAnsi="Segoe UI" w:cs="Segoe UI"/>
-          <w:color w:val="0F1115"/>
-          <w:kern w:val="0"/>
-          <w:sz w:val="24"/>
-          <w:szCs w:val="24"/>
-          <w:lang w:eastAsia="ru-RU"/>
-          <w14:ligatures w14:val="none"/>
-        </w:rPr>
-        <w:t>)</w:t>
+        <w:t> level2.tmx (создан в редакторе Tiled)</w:t>
       </w:r>
     </w:p>
     <w:p>
@@ -773,47 +602,19 @@
           <w:lang w:eastAsia="ru-RU"/>
           <w14:ligatures w14:val="none"/>
         </w:rPr>
-        <w:t>Фиксированная структура</w:t>
-      </w:r>
-      <w:proofErr w:type="gramStart"/>
-      <w:r>
-        <w:rPr>
-          <w:rFonts w:ascii="Segoe UI" w:eastAsia="Times New Roman" w:hAnsi="Segoe UI" w:cs="Segoe UI"/>
-          <w:b/>
-          <w:bCs/>
-          <w:color w:val="0F1115"/>
-          <w:kern w:val="0"/>
-          <w:sz w:val="24"/>
-          <w:szCs w:val="24"/>
-          <w:lang w:eastAsia="ru-RU"/>
-          <w14:ligatures w14:val="none"/>
-        </w:rPr>
-        <w:t>:</w:t>
-      </w:r>
-      <w:r>
-        <w:rPr>
-          <w:rFonts w:ascii="Segoe UI" w:eastAsia="Times New Roman" w:hAnsi="Segoe UI" w:cs="Segoe UI"/>
-          <w:color w:val="0F1115"/>
-          <w:kern w:val="0"/>
-          <w:sz w:val="24"/>
-          <w:szCs w:val="24"/>
-          <w:lang w:eastAsia="ru-RU"/>
-          <w14:ligatures w14:val="none"/>
-        </w:rPr>
-        <w:t> Заранее</w:t>
-      </w:r>
-      <w:proofErr w:type="gramEnd"/>
-      <w:r>
-        <w:rPr>
-          <w:rFonts w:ascii="Segoe UI" w:eastAsia="Times New Roman" w:hAnsi="Segoe UI" w:cs="Segoe UI"/>
-          <w:color w:val="0F1115"/>
-          <w:kern w:val="0"/>
-          <w:sz w:val="24"/>
-          <w:szCs w:val="24"/>
-          <w:lang w:eastAsia="ru-RU"/>
-          <w14:ligatures w14:val="none"/>
-        </w:rPr>
-        <w:t xml:space="preserve"> продуманный дизайн уровней</w:t>
+        <w:t>Фиксированная структура:</w:t>
+      </w:r>
+      <w:r>
+        <w:rPr>
+          <w:rFonts w:ascii="Segoe UI" w:eastAsia="Times New Roman" w:hAnsi="Segoe UI" w:cs="Segoe UI"/>
+          <w:color w:val="0F1115"/>
+          <w:kern w:val="0"/>
+          <w:sz w:val="24"/>
+          <w:szCs w:val="24"/>
+          <w:lang w:eastAsia="ru-RU"/>
+          <w14:ligatures w14:val="none"/>
+        </w:rPr>
+        <w:t> Заранее продуманный дизайн уровней</w:t>
       </w:r>
     </w:p>
     <w:p>
@@ -846,47 +647,19 @@
           <w:lang w:eastAsia="ru-RU"/>
           <w14:ligatures w14:val="none"/>
         </w:rPr>
-        <w:t>Границы</w:t>
-      </w:r>
-      <w:proofErr w:type="gramStart"/>
-      <w:r>
-        <w:rPr>
-          <w:rFonts w:ascii="Segoe UI" w:eastAsia="Times New Roman" w:hAnsi="Segoe UI" w:cs="Segoe UI"/>
-          <w:b/>
-          <w:bCs/>
-          <w:color w:val="0F1115"/>
-          <w:kern w:val="0"/>
-          <w:sz w:val="24"/>
-          <w:szCs w:val="24"/>
-          <w:lang w:eastAsia="ru-RU"/>
-          <w14:ligatures w14:val="none"/>
-        </w:rPr>
-        <w:t>:</w:t>
-      </w:r>
-      <w:r>
-        <w:rPr>
-          <w:rFonts w:ascii="Segoe UI" w:eastAsia="Times New Roman" w:hAnsi="Segoe UI" w:cs="Segoe UI"/>
-          <w:color w:val="0F1115"/>
-          <w:kern w:val="0"/>
-          <w:sz w:val="24"/>
-          <w:szCs w:val="24"/>
-          <w:lang w:eastAsia="ru-RU"/>
-          <w14:ligatures w14:val="none"/>
-        </w:rPr>
-        <w:t> Четко</w:t>
-      </w:r>
-      <w:proofErr w:type="gramEnd"/>
-      <w:r>
-        <w:rPr>
-          <w:rFonts w:ascii="Segoe UI" w:eastAsia="Times New Roman" w:hAnsi="Segoe UI" w:cs="Segoe UI"/>
-          <w:color w:val="0F1115"/>
-          <w:kern w:val="0"/>
-          <w:sz w:val="24"/>
-          <w:szCs w:val="24"/>
-          <w:lang w:eastAsia="ru-RU"/>
-          <w14:ligatures w14:val="none"/>
-        </w:rPr>
-        <w:t xml:space="preserve"> определенные пределы карты для камеры</w:t>
+        <w:t>Границы:</w:t>
+      </w:r>
+      <w:r>
+        <w:rPr>
+          <w:rFonts w:ascii="Segoe UI" w:eastAsia="Times New Roman" w:hAnsi="Segoe UI" w:cs="Segoe UI"/>
+          <w:color w:val="0F1115"/>
+          <w:kern w:val="0"/>
+          <w:sz w:val="24"/>
+          <w:szCs w:val="24"/>
+          <w:lang w:eastAsia="ru-RU"/>
+          <w14:ligatures w14:val="none"/>
+        </w:rPr>
+        <w:t> Четко определенные пределы карты для камеры</w:t>
       </w:r>
     </w:p>
     <w:p>
@@ -948,37 +721,7 @@
           <w:lang w:eastAsia="ru-RU"/>
           <w14:ligatures w14:val="none"/>
         </w:rPr>
-        <w:t xml:space="preserve">Фиксированные точки </w:t>
-      </w:r>
-      <w:proofErr w:type="spellStart"/>
-      <w:r>
-        <w:rPr>
-          <w:rFonts w:ascii="Segoe UI" w:eastAsia="Times New Roman" w:hAnsi="Segoe UI" w:cs="Segoe UI"/>
-          <w:b/>
-          <w:bCs/>
-          <w:color w:val="0F1115"/>
-          <w:kern w:val="0"/>
-          <w:sz w:val="24"/>
-          <w:szCs w:val="24"/>
-          <w:lang w:eastAsia="ru-RU"/>
-          <w14:ligatures w14:val="none"/>
-        </w:rPr>
-        <w:t>спавна</w:t>
-      </w:r>
-      <w:proofErr w:type="spellEnd"/>
-      <w:r>
-        <w:rPr>
-          <w:rFonts w:ascii="Segoe UI" w:eastAsia="Times New Roman" w:hAnsi="Segoe UI" w:cs="Segoe UI"/>
-          <w:b/>
-          <w:bCs/>
-          <w:color w:val="0F1115"/>
-          <w:kern w:val="0"/>
-          <w:sz w:val="24"/>
-          <w:szCs w:val="24"/>
-          <w:lang w:eastAsia="ru-RU"/>
-          <w14:ligatures w14:val="none"/>
-        </w:rPr>
-        <w:t>:</w:t>
+        <w:t>Фиксированные точки спавна:</w:t>
       </w:r>
       <w:r>
         <w:rPr>
@@ -1227,19 +970,7 @@
           <w:lang w:eastAsia="ru-RU"/>
           <w14:ligatures w14:val="none"/>
         </w:rPr>
-        <w:t>красной</w:t>
-      </w:r>
-      <w:r>
-        <w:rPr>
-          <w:rFonts w:ascii="Segoe UI" w:eastAsia="Times New Roman" w:hAnsi="Segoe UI" w:cs="Segoe UI"/>
-          <w:color w:val="0F1115"/>
-          <w:kern w:val="0"/>
-          <w:sz w:val="24"/>
-          <w:szCs w:val="24"/>
-          <w:lang w:eastAsia="ru-RU"/>
-          <w14:ligatures w14:val="none"/>
-        </w:rPr>
-        <w:t xml:space="preserve"> аурой </w:t>
+        <w:t xml:space="preserve">красной аурой </w:t>
       </w:r>
     </w:p>
     <w:p>
@@ -1379,19 +1110,7 @@
           <w:lang w:eastAsia="ru-RU"/>
           <w14:ligatures w14:val="none"/>
         </w:rPr>
-        <w:t>золотой</w:t>
-      </w:r>
-      <w:r>
-        <w:rPr>
-          <w:rFonts w:ascii="Segoe UI" w:eastAsia="Times New Roman" w:hAnsi="Segoe UI" w:cs="Segoe UI"/>
-          <w:color w:val="0F1115"/>
-          <w:kern w:val="0"/>
-          <w:sz w:val="24"/>
-          <w:szCs w:val="24"/>
-          <w:lang w:eastAsia="ru-RU"/>
-          <w14:ligatures w14:val="none"/>
-        </w:rPr>
-        <w:t xml:space="preserve"> аурой </w:t>
+        <w:t xml:space="preserve">золотой аурой </w:t>
       </w:r>
     </w:p>
     <w:p>
@@ -1932,47 +1651,19 @@
           <w:lang w:eastAsia="ru-RU"/>
           <w14:ligatures w14:val="none"/>
         </w:rPr>
-        <w:t>Опыт</w:t>
-      </w:r>
-      <w:proofErr w:type="gramStart"/>
-      <w:r>
-        <w:rPr>
-          <w:rFonts w:ascii="Segoe UI" w:eastAsia="Times New Roman" w:hAnsi="Segoe UI" w:cs="Segoe UI"/>
-          <w:b/>
-          <w:bCs/>
-          <w:color w:val="0F1115"/>
-          <w:kern w:val="0"/>
-          <w:sz w:val="24"/>
-          <w:szCs w:val="24"/>
-          <w:lang w:eastAsia="ru-RU"/>
-          <w14:ligatures w14:val="none"/>
-        </w:rPr>
-        <w:t>:</w:t>
-      </w:r>
-      <w:r>
-        <w:rPr>
-          <w:rFonts w:ascii="Segoe UI" w:eastAsia="Times New Roman" w:hAnsi="Segoe UI" w:cs="Segoe UI"/>
-          <w:color w:val="0F1115"/>
-          <w:kern w:val="0"/>
-          <w:sz w:val="24"/>
-          <w:szCs w:val="24"/>
-          <w:lang w:eastAsia="ru-RU"/>
-          <w14:ligatures w14:val="none"/>
-        </w:rPr>
-        <w:t> Получается</w:t>
-      </w:r>
-      <w:proofErr w:type="gramEnd"/>
-      <w:r>
-        <w:rPr>
-          <w:rFonts w:ascii="Segoe UI" w:eastAsia="Times New Roman" w:hAnsi="Segoe UI" w:cs="Segoe UI"/>
-          <w:color w:val="0F1115"/>
-          <w:kern w:val="0"/>
-          <w:sz w:val="24"/>
-          <w:szCs w:val="24"/>
-          <w:lang w:eastAsia="ru-RU"/>
-          <w14:ligatures w14:val="none"/>
-        </w:rPr>
-        <w:t xml:space="preserve"> за победу над врагами</w:t>
+        <w:t>Опыт:</w:t>
+      </w:r>
+      <w:r>
+        <w:rPr>
+          <w:rFonts w:ascii="Segoe UI" w:eastAsia="Times New Roman" w:hAnsi="Segoe UI" w:cs="Segoe UI"/>
+          <w:color w:val="0F1115"/>
+          <w:kern w:val="0"/>
+          <w:sz w:val="24"/>
+          <w:szCs w:val="24"/>
+          <w:lang w:eastAsia="ru-RU"/>
+          <w14:ligatures w14:val="none"/>
+        </w:rPr>
+        <w:t> Получается за победу над врагами</w:t>
       </w:r>
     </w:p>
     <w:p>
@@ -2005,37 +1696,7 @@
           <w:lang w:eastAsia="ru-RU"/>
           <w14:ligatures w14:val="none"/>
         </w:rPr>
-        <w:t xml:space="preserve">Золотые </w:t>
-      </w:r>
-      <w:proofErr w:type="spellStart"/>
-      <w:r>
-        <w:rPr>
-          <w:rFonts w:ascii="Segoe UI" w:eastAsia="Times New Roman" w:hAnsi="Segoe UI" w:cs="Segoe UI"/>
-          <w:b/>
-          <w:bCs/>
-          <w:color w:val="0F1115"/>
-          <w:kern w:val="0"/>
-          <w:sz w:val="24"/>
-          <w:szCs w:val="24"/>
-          <w:lang w:eastAsia="ru-RU"/>
-          <w14:ligatures w14:val="none"/>
-        </w:rPr>
-        <w:t>тайлы</w:t>
-      </w:r>
-      <w:proofErr w:type="spellEnd"/>
-      <w:r>
-        <w:rPr>
-          <w:rFonts w:ascii="Segoe UI" w:eastAsia="Times New Roman" w:hAnsi="Segoe UI" w:cs="Segoe UI"/>
-          <w:b/>
-          <w:bCs/>
-          <w:color w:val="0F1115"/>
-          <w:kern w:val="0"/>
-          <w:sz w:val="24"/>
-          <w:szCs w:val="24"/>
-          <w:lang w:eastAsia="ru-RU"/>
-          <w14:ligatures w14:val="none"/>
-        </w:rPr>
-        <w:t>:</w:t>
+        <w:t>Золотые тайлы:</w:t>
       </w:r>
       <w:r>
         <w:rPr>
@@ -2092,33 +1753,7 @@
           <w:lang w:eastAsia="ru-RU"/>
           <w14:ligatures w14:val="none"/>
         </w:rPr>
-        <w:t xml:space="preserve"> В </w:t>
-      </w:r>
-      <w:proofErr w:type="spellStart"/>
-      <w:r>
-        <w:rPr>
-          <w:rFonts w:ascii="Segoe UI" w:eastAsia="Times New Roman" w:hAnsi="Segoe UI" w:cs="Segoe UI"/>
-          <w:color w:val="0F1115"/>
-          <w:kern w:val="0"/>
-          <w:sz w:val="24"/>
-          <w:szCs w:val="24"/>
-          <w:lang w:eastAsia="ru-RU"/>
-          <w14:ligatures w14:val="none"/>
-        </w:rPr>
-        <w:t>SQLite</w:t>
-      </w:r>
-      <w:proofErr w:type="spellEnd"/>
-      <w:r>
-        <w:rPr>
-          <w:rFonts w:ascii="Segoe UI" w:eastAsia="Times New Roman" w:hAnsi="Segoe UI" w:cs="Segoe UI"/>
-          <w:color w:val="0F1115"/>
-          <w:kern w:val="0"/>
-          <w:sz w:val="24"/>
-          <w:szCs w:val="24"/>
-          <w:lang w:eastAsia="ru-RU"/>
-          <w14:ligatures w14:val="none"/>
-        </w:rPr>
-        <w:t xml:space="preserve"> базе данных</w:t>
+        <w:t> В SQLite базе данных</w:t>
       </w:r>
     </w:p>
     <w:p>
@@ -2315,47 +1950,19 @@
           <w:lang w:eastAsia="ru-RU"/>
           <w14:ligatures w14:val="none"/>
         </w:rPr>
-        <w:t>Обнаружение врагов</w:t>
-      </w:r>
-      <w:proofErr w:type="gramStart"/>
-      <w:r>
-        <w:rPr>
-          <w:rFonts w:ascii="Segoe UI" w:eastAsia="Times New Roman" w:hAnsi="Segoe UI" w:cs="Segoe UI"/>
-          <w:b/>
-          <w:bCs/>
-          <w:color w:val="0F1115"/>
-          <w:kern w:val="0"/>
-          <w:sz w:val="24"/>
-          <w:szCs w:val="24"/>
-          <w:lang w:eastAsia="ru-RU"/>
-          <w14:ligatures w14:val="none"/>
-        </w:rPr>
-        <w:t>:</w:t>
-      </w:r>
-      <w:r>
-        <w:rPr>
-          <w:rFonts w:ascii="Segoe UI" w:eastAsia="Times New Roman" w:hAnsi="Segoe UI" w:cs="Segoe UI"/>
-          <w:color w:val="0F1115"/>
-          <w:kern w:val="0"/>
-          <w:sz w:val="24"/>
-          <w:szCs w:val="24"/>
-          <w:lang w:eastAsia="ru-RU"/>
-          <w14:ligatures w14:val="none"/>
-        </w:rPr>
-        <w:t> При</w:t>
-      </w:r>
-      <w:proofErr w:type="gramEnd"/>
-      <w:r>
-        <w:rPr>
-          <w:rFonts w:ascii="Segoe UI" w:eastAsia="Times New Roman" w:hAnsi="Segoe UI" w:cs="Segoe UI"/>
-          <w:color w:val="0F1115"/>
-          <w:kern w:val="0"/>
-          <w:sz w:val="24"/>
-          <w:szCs w:val="24"/>
-          <w:lang w:eastAsia="ru-RU"/>
-          <w14:ligatures w14:val="none"/>
-        </w:rPr>
-        <w:t xml:space="preserve"> столкновении запускается битва</w:t>
+        <w:t>Обнаружение врагов:</w:t>
+      </w:r>
+      <w:r>
+        <w:rPr>
+          <w:rFonts w:ascii="Segoe UI" w:eastAsia="Times New Roman" w:hAnsi="Segoe UI" w:cs="Segoe UI"/>
+          <w:color w:val="0F1115"/>
+          <w:kern w:val="0"/>
+          <w:sz w:val="24"/>
+          <w:szCs w:val="24"/>
+          <w:lang w:eastAsia="ru-RU"/>
+          <w14:ligatures w14:val="none"/>
+        </w:rPr>
+        <w:t> При столкновении запускается битва</w:t>
       </w:r>
     </w:p>
     <w:p>
@@ -2646,7 +2253,31 @@
           <w:lang w:eastAsia="ru-RU"/>
           <w14:ligatures w14:val="none"/>
         </w:rPr>
-        <w:t> Python 3.8+</w:t>
+        <w:t> Python 3.</w:t>
+      </w:r>
+      <w:r>
+        <w:rPr>
+          <w:rFonts w:ascii="Segoe UI" w:eastAsia="Times New Roman" w:hAnsi="Segoe UI" w:cs="Segoe UI"/>
+          <w:color w:val="0F1115"/>
+          <w:kern w:val="0"/>
+          <w:sz w:val="24"/>
+          <w:szCs w:val="24"/>
+          <w:lang w:eastAsia="ru-RU"/>
+          <w14:ligatures w14:val="none"/>
+        </w:rPr>
+        <w:t>14</w:t>
+      </w:r>
+      <w:r>
+        <w:rPr>
+          <w:rFonts w:ascii="Segoe UI" w:eastAsia="Times New Roman" w:hAnsi="Segoe UI" w:cs="Segoe UI"/>
+          <w:color w:val="0F1115"/>
+          <w:kern w:val="0"/>
+          <w:sz w:val="24"/>
+          <w:szCs w:val="24"/>
+          <w:lang w:eastAsia="ru-RU"/>
+          <w14:ligatures w14:val="none"/>
+        </w:rPr>
+        <w:t>+</w:t>
       </w:r>
     </w:p>
     <w:p>
@@ -2691,33 +2322,7 @@
           <w:lang w:eastAsia="ru-RU"/>
           <w14:ligatures w14:val="none"/>
         </w:rPr>
-        <w:t> </w:t>
-      </w:r>
-      <w:proofErr w:type="spellStart"/>
-      <w:r>
-        <w:rPr>
-          <w:rFonts w:ascii="Segoe UI" w:eastAsia="Times New Roman" w:hAnsi="Segoe UI" w:cs="Segoe UI"/>
-          <w:color w:val="0F1115"/>
-          <w:kern w:val="0"/>
-          <w:sz w:val="24"/>
-          <w:szCs w:val="24"/>
-          <w:lang w:eastAsia="ru-RU"/>
-          <w14:ligatures w14:val="none"/>
-        </w:rPr>
-        <w:t>Arcade</w:t>
-      </w:r>
-      <w:proofErr w:type="spellEnd"/>
-      <w:r>
-        <w:rPr>
-          <w:rFonts w:ascii="Segoe UI" w:eastAsia="Times New Roman" w:hAnsi="Segoe UI" w:cs="Segoe UI"/>
-          <w:color w:val="0F1115"/>
-          <w:kern w:val="0"/>
-          <w:sz w:val="24"/>
-          <w:szCs w:val="24"/>
-          <w:lang w:eastAsia="ru-RU"/>
-          <w14:ligatures w14:val="none"/>
-        </w:rPr>
-        <w:t xml:space="preserve"> (графика, звук, управление)</w:t>
+        <w:t> Arcade (графика, звук, управление)</w:t>
       </w:r>
     </w:p>
     <w:p>
@@ -2944,7 +2549,6 @@
           <w14:ligatures w14:val="none"/>
         </w:rPr>
       </w:pPr>
-      <w:proofErr w:type="spellStart"/>
       <w:r>
         <w:rPr>
           <w:rFonts w:ascii="Segoe UI" w:eastAsia="Times New Roman" w:hAnsi="Segoe UI" w:cs="Segoe UI"/>
@@ -2957,7 +2561,6 @@
         </w:rPr>
         <w:t>arcade</w:t>
       </w:r>
-      <w:proofErr w:type="spellEnd"/>
     </w:p>
     <w:p>
       <w:pPr>
@@ -3008,7 +2611,6 @@
           <w14:ligatures w14:val="none"/>
         </w:rPr>
       </w:pPr>
-      <w:proofErr w:type="spellStart"/>
       <w:r>
         <w:rPr>
           <w:rFonts w:ascii="Segoe UI" w:eastAsia="Times New Roman" w:hAnsi="Segoe UI" w:cs="Segoe UI"/>
@@ -3021,7 +2623,6 @@
         </w:rPr>
         <w:t>random</w:t>
       </w:r>
-      <w:proofErr w:type="spellEnd"/>
     </w:p>
     <w:p>
       <w:pPr>
@@ -3041,7 +2642,6 @@
           <w14:ligatures w14:val="none"/>
         </w:rPr>
       </w:pPr>
-      <w:proofErr w:type="spellStart"/>
       <w:r>
         <w:rPr>
           <w:rFonts w:ascii="Segoe UI" w:eastAsia="Times New Roman" w:hAnsi="Segoe UI" w:cs="Segoe UI"/>
@@ -3054,7 +2654,6 @@
         </w:rPr>
         <w:t>time</w:t>
       </w:r>
-      <w:proofErr w:type="spellEnd"/>
     </w:p>
     <w:p>
       <w:pPr>
@@ -3250,7 +2849,6 @@
         </w:rPr>
         <w:t xml:space="preserve">окно </w:t>
       </w:r>
-      <w:proofErr w:type="spellStart"/>
       <w:r>
         <w:rPr>
           <w:rFonts w:ascii="Segoe UI" w:eastAsia="Times New Roman" w:hAnsi="Segoe UI" w:cs="Segoe UI"/>
@@ -3263,22 +2861,7 @@
           <w:lang w:eastAsia="ru-RU"/>
           <w14:ligatures w14:val="none"/>
         </w:rPr>
-        <w:t>BattleWindow</w:t>
-      </w:r>
-      <w:proofErr w:type="spellEnd"/>
-      <w:r>
-        <w:rPr>
-          <w:rFonts w:ascii="Segoe UI" w:eastAsia="Times New Roman" w:hAnsi="Segoe UI" w:cs="Segoe UI"/>
-          <w:b/>
-          <w:bCs/>
-          <w:color w:val="0F1115"/>
-          <w:kern w:val="0"/>
-          <w:sz w:val="24"/>
-          <w:szCs w:val="24"/>
-          <w:lang w:eastAsia="ru-RU"/>
-          <w14:ligatures w14:val="none"/>
-        </w:rPr>
-        <w:t>):</w:t>
+        <w:t>BattleWindow):</w:t>
       </w:r>
     </w:p>
     <w:p>
@@ -3979,24 +3562,8 @@
           <w:lang w:eastAsia="ru-RU"/>
           <w14:ligatures w14:val="none"/>
         </w:rPr>
-        <w:t xml:space="preserve"> </w:t>
-      </w:r>
-      <w:proofErr w:type="spellStart"/>
-      <w:r>
-        <w:rPr>
-          <w:rFonts w:ascii="Segoe UI" w:eastAsia="Times New Roman" w:hAnsi="Segoe UI" w:cs="Segoe UI"/>
-          <w:b/>
-          <w:bCs/>
-          <w:color w:val="0F1115"/>
-          <w:kern w:val="0"/>
-          <w:sz w:val="24"/>
-          <w:szCs w:val="24"/>
-          <w:lang w:eastAsia="ru-RU"/>
-          <w14:ligatures w14:val="none"/>
-        </w:rPr>
-        <w:t>Геймдизайн</w:t>
-      </w:r>
-      <w:proofErr w:type="spellEnd"/>
+        <w:t xml:space="preserve"> Геймдизайн</w:t>
+      </w:r>
     </w:p>
     <w:p>
       <w:pPr>

</xml_diff>

<commit_message>
The explanatory note has been updated
</commit_message>
<xml_diff>
--- a/Пояснительная записка.docx
+++ b/Пояснительная записка.docx
@@ -2266,18 +2266,6 @@
           <w14:ligatures w14:val="none"/>
         </w:rPr>
         <w:t>14</w:t>
-      </w:r>
-      <w:r>
-        <w:rPr>
-          <w:rFonts w:ascii="Segoe UI" w:eastAsia="Times New Roman" w:hAnsi="Segoe UI" w:cs="Segoe UI"/>
-          <w:color w:val="0F1115"/>
-          <w:kern w:val="0"/>
-          <w:sz w:val="24"/>
-          <w:szCs w:val="24"/>
-          <w:lang w:eastAsia="ru-RU"/>
-          <w14:ligatures w14:val="none"/>
-        </w:rPr>
-        <w:t>+</w:t>
       </w:r>
     </w:p>
     <w:p>

</xml_diff>